<commit_message>
docs: nouveau positionnement « optimise les dépenses auto de tout le monde »
- Plan d'affaires (titre + résumé) et pitch deck (cover) repositionnés :
  Pièces optimise les dépenses automobiles de tout le monde (du propriétaire
  d'un véhicule au gestionnaire de flotte), sans citer les mécaniciens
- Mémoire : positionnement officiel + axe de campagne marketing

Co-Authored-By: Claude Opus 4.8 (1M context) <noreply@anthropic.com>
</commit_message>
<xml_diff>
--- a/docs/plan-affaires-pieces-2026-06.docx
+++ b/docs/plan-affaires-pieces-2026-06.docx
@@ -2,13 +2,13 @@
 <file path=word/document.xml><?xml version="1.0" encoding="utf-8"?>
 <w:document xmlns:w="http://schemas.openxmlformats.org/wordprocessingml/2006/main" xmlns:m="http://schemas.openxmlformats.org/officeDocument/2006/math" xmlns:r="http://schemas.openxmlformats.org/officeDocument/2006/relationships" xmlns:o="urn:schemas-microsoft-com:office:office" xmlns:v="urn:schemas-microsoft-com:vml" xmlns:w10="urn:schemas-microsoft-com:office:word" xmlns:a="http://schemas.openxmlformats.org/drawingml/2006/main" xmlns:pic="http://schemas.openxmlformats.org/drawingml/2006/picture" xmlns:wp="http://schemas.openxmlformats.org/drawingml/2006/wordprocessingDrawing">
   <w:body>
-    <w:bookmarkStart w:id="29" w:name="X6ed6bc04cc428fe977a79a594d28fa10c7fdde1"/>
+    <w:bookmarkStart w:id="29" w:name="Xd714abeeb5b93ba7f1e27ed89487f8b20e44a24"/>
     <w:p>
       <w:pPr>
         <w:pStyle w:val="Heading1"/>
       </w:pPr>
       <w:r>
-        <w:t xml:space="preserve">Pièces — l'infrastructure de confiance de la pièce auto en Côte d'Ivoire</w:t>
+        <w:t xml:space="preserve">Pièces — optimiser les dépenses automobiles en Côte d'Ivoire</w:t>
       </w:r>
     </w:p>
     <w:bookmarkStart w:id="9" w:name="X1f4c035d5ce0a3ab517d490c1a072f2cfffa800"/>
@@ -29,13 +29,13 @@
           <w:b/>
           <w:bCs/>
         </w:rPr>
-        <w:t xml:space="preserve">Pièces</w:t>
-      </w:r>
-      <w:r>
-        <w:t xml:space="preserve"> </w:t>
-      </w:r>
-      <w:r>
-        <w:t xml:space="preserve">digitalise l'achat de pièces détachées automobiles en Côte d'Ivoire. La plateforme réunit trois produits sur une seule infrastructure :</w:t>
+        <w:t xml:space="preserve">Pièces optimise les dépenses automobiles de tout le monde en Côte d'Ivoire</w:t>
+      </w:r>
+      <w:r>
+        <w:t xml:space="preserve"> </w:t>
+      </w:r>
+      <w:r>
+        <w:t xml:space="preserve">— du propriétaire d'un seul véhicule au gestionnaire d'une flotte de mille. La plateforme réunit trois produits sur une seule infrastructure :</w:t>
       </w:r>
     </w:p>
     <w:p>

</xml_diff>

<commit_message>
docs: humanise le plan d'affaires (suppression des tirets cadratins, hype et triples forcés)
Co-Authored-By: Claude Opus 4.8 (1M context) <noreply@anthropic.com>
</commit_message>
<xml_diff>
--- a/docs/plan-affaires-pieces-2026-06.docx
+++ b/docs/plan-affaires-pieces-2026-06.docx
@@ -8,7 +8,7 @@
         <w:pStyle w:val="Heading1"/>
       </w:pPr>
       <w:r>
-        <w:t xml:space="preserve">Pièces — optimiser les dépenses automobiles en Côte d'Ivoire</w:t>
+        <w:t xml:space="preserve">Pièces : optimiser les dépenses automobiles en Côte d'Ivoire</w:t>
       </w:r>
     </w:p>
     <w:bookmarkStart w:id="9" w:name="X1f4c035d5ce0a3ab517d490c1a072f2cfffa800"/>
@@ -32,10 +32,7 @@
         <w:t xml:space="preserve">Pièces optimise les dépenses automobiles de tout le monde en Côte d'Ivoire</w:t>
       </w:r>
       <w:r>
-        <w:t xml:space="preserve"> </w:t>
-      </w:r>
-      <w:r>
-        <w:t xml:space="preserve">— du propriétaire d'un seul véhicule au gestionnaire d'une flotte de mille. La plateforme réunit trois produits sur une seule infrastructure :</w:t>
+        <w:t xml:space="preserve">, du propriétaire d'un seul véhicule au gestionnaire d'une flotte de mille. La plateforme réunit trois produits sur une seule infrastructure :</w:t>
       </w:r>
     </w:p>
     <w:p>
@@ -57,7 +54,7 @@
         <w:t xml:space="preserve"> </w:t>
       </w:r>
       <w:r>
-        <w:t xml:space="preserve">— le mécanicien identifie la pièce (recherche, photo IA, VIN), le propriétaire paie en Mobile Money via</w:t>
+        <w:t xml:space="preserve">: le mécanicien identifie la pièce (recherche, photo IA, VIN), le propriétaire paie en Mobile Money via</w:t>
       </w:r>
       <w:r>
         <w:t xml:space="preserve"> </w:t>
@@ -70,7 +67,7 @@
         <w:t xml:space="preserve">escrow</w:t>
       </w:r>
       <w:r>
-        <w:t xml:space="preserve">, le vendeur livre. Prix affichés, condition de la pièce affichée (chip Neuf / Occasion / Ré-usiné / Aftermarket / OEM), garantie, facture.</w:t>
+        <w:t xml:space="preserve">, le vendeur livre. Prix affiché, condition de la pièce affichée (chip Neuf / Occasion / Ré-usiné / Aftermarket / OEM), garantie, facture.</w:t>
       </w:r>
     </w:p>
     <w:p>
@@ -92,7 +89,7 @@
         <w:t xml:space="preserve"> </w:t>
       </w:r>
       <w:r>
-        <w:t xml:space="preserve">—</w:t>
+        <w:t xml:space="preserve">:</w:t>
       </w:r>
       <w:r>
         <w:t xml:space="preserve"> </w:t>
@@ -122,7 +119,7 @@
         <w:t xml:space="preserve"> </w:t>
       </w:r>
       <w:r>
-        <w:t xml:space="preserve">(10 000 F/véh/mois) : pilotage du coût total de possession, détection des véhicules « gouffres », alertes d'entretien, livraison express, facturation consolidée, conformité fiscale.</w:t>
+        <w:t xml:space="preserve">(10 000 F/véh/mois) assurent le pilotage du coût total de possession, la détection des véhicules « gouffres », les alertes d'entretien, la livraison express, la facturation consolidée et la conformité fiscale.</w:t>
       </w:r>
     </w:p>
     <w:p>
@@ -144,7 +141,7 @@
         <w:t xml:space="preserve"> </w:t>
       </w:r>
       <w:r>
-        <w:t xml:space="preserve">— les agents terrain digitalisent les vendeurs</w:t>
+        <w:t xml:space="preserve">: les agents terrain digitalisent les vendeurs</w:t>
       </w:r>
       <w:r>
         <w:t xml:space="preserve"> </w:t>
@@ -157,7 +154,7 @@
         <w:t xml:space="preserve">formels et informels</w:t>
       </w:r>
       <w:r>
-        <w:t xml:space="preserve">, de l'importateur en gros au vendeur de détail. Notre douve concurrentielle est la</w:t>
+        <w:t xml:space="preserve">, de l'importateur en gros au vendeur de détail. Notre douve, c'est la</w:t>
       </w:r>
       <w:r>
         <w:t xml:space="preserve"> </w:t>
@@ -272,7 +269,7 @@
         <w:t xml:space="preserve"> </w:t>
       </w:r>
       <w:r>
-        <w:t xml:space="preserve">pour financer 18–24 mois d'exécution — verrouiller Adjamé, prendre la verticale VTC via un partenariat Yango, et atteindre les jalons d'une Série A.</w:t>
+        <w:t xml:space="preserve">pour financer 18 à 24 mois d'exécution : verrouiller Adjamé, prendre la verticale VTC via un partenariat Yango et atteindre les jalons d'une Série A.</w:t>
       </w:r>
     </w:p>
     <w:bookmarkEnd w:id="9"/>
@@ -330,7 +327,7 @@
         <w:t xml:space="preserve"> </w:t>
       </w:r>
       <w:r>
-        <w:t xml:space="preserve">— grossiste, semi-grossiste, détaillant, et souvent le mécanicien à qui l'on confie l'achat. L'acheteur final paie l'accumulation de ces marges opaques, sans jamais voir le vrai prix.</w:t>
+        <w:t xml:space="preserve">: grossiste, semi-grossiste, détaillant, et souvent le mécanicien à qui l'on confie l'achat. L'acheteur final paie l'accumulation de ces marges opaques, sans jamais voir le vrai prix.</w:t>
       </w:r>
     </w:p>
     <w:p>
@@ -352,7 +349,7 @@
         <w:t xml:space="preserve"> </w:t>
       </w:r>
       <w:r>
-        <w:t xml:space="preserve">paie 30 à 60 % trop cher — autant de surcoût qu'il y a d'intermédiaires sur la pièce — faute de prix de référence, et sans aucune garantie.</w:t>
+        <w:t xml:space="preserve">paie 30 à 60 % trop cher, faute de prix de référence et sans aucune garantie. Le surcoût grandit avec chaque intermédiaire sur la pièce.</w:t>
       </w:r>
     </w:p>
     <w:p>
@@ -428,10 +425,7 @@
         <w:t xml:space="preserve">Le vendeur</w:t>
       </w:r>
       <w:r>
-        <w:t xml:space="preserve"> </w:t>
-      </w:r>
-      <w:r>
-        <w:t xml:space="preserve">— de l'importateur en gros au détaillant — n'a aucun moyen de toucher une clientèle au-delà de son comptoir.</w:t>
+        <w:t xml:space="preserve">, de l'importateur en gros au détaillant, n'a aucun moyen de toucher une clientèle au-delà de son comptoir.</w:t>
       </w:r>
     </w:p>
     <w:p>
@@ -487,7 +481,7 @@
         <w:t xml:space="preserve"> </w:t>
       </w:r>
       <w:r>
-        <w:t xml:space="preserve">: l'acheteur voit le prix réel, compare les fournisseurs et achète au plus près de la source — quel que soit le nombre d'intermédiaires. Les marges opaques s'effondrent ; le surcoût disparaît.</w:t>
+        <w:t xml:space="preserve">: l'acheteur voit le prix réel, compare les fournisseurs et achète au plus près de la source, quel que soit le nombre d'intermédiaires. Les marges opaques s'effondrent et le surcoût disparaît.</w:t>
       </w:r>
     </w:p>
     <w:tbl>
@@ -881,7 +875,7 @@
           <w:b/>
           <w:bCs/>
         </w:rPr>
-        <w:t xml:space="preserve">~400–420 Mds FCFA/an</w:t>
+        <w:t xml:space="preserve">~400-420 Mds FCFA/an</w:t>
       </w:r>
       <w:r>
         <w:t xml:space="preserve">. Les importations de véhicules neufs ont triplé depuis 2017 (≈ 27 000 en 2024, objectif ~50 000 en 2025), rajeunissant le parc et augmentant la consommation de pièces de qualité.</w:t>
@@ -1041,7 +1035,7 @@
               <w:pStyle w:val="Compact"/>
             </w:pPr>
             <w:r>
-              <w:t xml:space="preserve">~25 000–30 000</w:t>
+              <w:t xml:space="preserve">~25 000-30 000</w:t>
             </w:r>
           </w:p>
         </w:tc>
@@ -1350,7 +1344,7 @@
           <w:b/>
           <w:bCs/>
         </w:rPr>
-        <w:t xml:space="preserve">5 000–6 000 chauffeurs en 2024</w:t>
+        <w:t xml:space="preserve">5 000-6 000 chauffeurs en 2024</w:t>
       </w:r>
       <w:r>
         <w:t xml:space="preserve"> </w:t>
@@ -1425,10 +1419,7 @@
         <w:pStyle w:val="BodyText"/>
       </w:pPr>
       <w:r>
-        <w:t xml:space="preserve">La demande de mobilité est massive —</w:t>
-      </w:r>
-      <w:r>
-        <w:t xml:space="preserve"> </w:t>
+        <w:t xml:space="preserve">La demande de mobilité est massive (</w:t>
       </w:r>
       <w:r>
         <w:rPr>
@@ -1438,10 +1429,7 @@
         <w:t xml:space="preserve">~4 milliards FCFA dépensés par jour en déplacements à Abidjan</w:t>
       </w:r>
       <w:r>
-        <w:t xml:space="preserve"> </w:t>
-      </w:r>
-      <w:r>
-        <w:t xml:space="preserve">— et Yango recrute en continu : le marché est tiré par la demande, pas saturé côté offre.</w:t>
+        <w:t xml:space="preserve">) et Yango recrute en continu : le marché est tiré par la demande, pas saturé côté offre.</w:t>
       </w:r>
     </w:p>
     <w:p>
@@ -1494,7 +1482,7 @@
         <w:t xml:space="preserve">~1,3 M FCFA/véh/an</w:t>
       </w:r>
       <w:r>
-        <w:t xml:space="preserve">), et chaque jour d'immobilisation détruit directement du revenu (15 000–30 000 F/jour). Douleur aiguë, récurrente, mesurable — idéale pour prouver le ROI, bâtir les cas clients et la base de données fitments, avant d'étendre au parc entier.</w:t>
+        <w:t xml:space="preserve">), et chaque jour d'immobilisation détruit directement du revenu (15 000-30 000 F/jour). La douleur est aiguë, récurrente et mesurable : idéale pour prouver le ROI, bâtir les cas clients et la base de données fitments avant d'étendre au parc entier.</w:t>
       </w:r>
       <w:r>
         <w:t xml:space="preserve"> </w:t>
@@ -1522,7 +1510,7 @@
         <w:pStyle w:val="FirstParagraph"/>
       </w:pPr>
       <w:r>
-        <w:t xml:space="preserve">Restriction de l'âge des véhicules importés, rajeunissement du parc, montée du Mobile Money (Orange Money, MTN, Wave), formalisation fiscale (FNE-CI) : tous les vents portent vers une digitalisation de l'après-vente automobile. La fenêtre est ouverte</w:t>
+        <w:t xml:space="preserve">Quatre tendances poussent dans le même sens : la restriction de l'âge des véhicules importés, le rajeunissement du parc, la montée du Mobile Money (Orange Money, MTN, Wave) et la formalisation fiscale (FNE-CI). L'après-vente automobile se digitalise, et le moment d'entrer, c'est</w:t>
       </w:r>
       <w:r>
         <w:t xml:space="preserve"> </w:t>
@@ -1699,7 +1687,7 @@
               <w:pStyle w:val="Compact"/>
             </w:pPr>
             <w:r>
-              <w:t xml:space="preserve">Capital, pourraient acquérir à 24–36 mois</w:t>
+              <w:t xml:space="preserve">Capital, pourraient acquérir à 24-36 mois</w:t>
             </w:r>
           </w:p>
         </w:tc>
@@ -1819,13 +1807,13 @@
           <w:b/>
           <w:bCs/>
         </w:rPr>
-        <w:t xml:space="preserve">Le réseau Liaison &amp; la cartographie de la chaîne</w:t>
-      </w:r>
-      <w:r>
-        <w:t xml:space="preserve"> </w:t>
-      </w:r>
-      <w:r>
-        <w:t xml:space="preserve">— agents terrain qui recensent et digitalisent tous les acteurs (importateurs en gros → détaillants, formels et informels) et leurs produits, même hors ligne. Objectif : 80 agents sous 12 mois.</w:t>
+        <w:t xml:space="preserve">Le réseau Liaison et la cartographie de la chaîne</w:t>
+      </w:r>
+      <w:r>
+        <w:t xml:space="preserve"> </w:t>
+      </w:r>
+      <w:r>
+        <w:t xml:space="preserve">: des agents terrain qui recensent et digitalisent tous les acteurs (importateurs en gros jusqu'aux détaillants, formels comme informels) et leurs produits, même hors ligne. Objectif : 80 agents sous 12 mois.</w:t>
       </w:r>
     </w:p>
     <w:p>
@@ -1847,7 +1835,7 @@
         <w:t xml:space="preserve"> </w:t>
       </w:r>
       <w:r>
-        <w:t xml:space="preserve">— quelle pièce va sur quel véhicule local ; inattaquable à 100 000 transactions.</w:t>
+        <w:t xml:space="preserve">: quelle pièce va sur quel véhicule local. Inattaquable à 100 000 transactions.</w:t>
       </w:r>
     </w:p>
     <w:p>
@@ -1863,13 +1851,13 @@
           <w:b/>
           <w:bCs/>
         </w:rPr>
-        <w:t xml:space="preserve">L'escrow Mobile Money + garantie Pièces</w:t>
-      </w:r>
-      <w:r>
-        <w:t xml:space="preserve"> </w:t>
-      </w:r>
-      <w:r>
-        <w:t xml:space="preserve">— confiance institutionnelle dans un marché de méfiance.</w:t>
+        <w:t xml:space="preserve">L'escrow Mobile Money et la garantie Pièces</w:t>
+      </w:r>
+      <w:r>
+        <w:t xml:space="preserve"> </w:t>
+      </w:r>
+      <w:r>
+        <w:t xml:space="preserve">: de la confiance institutionnelle dans un marché de méfiance.</w:t>
       </w:r>
     </w:p>
     <w:p>
@@ -1891,7 +1879,7 @@
         <w:t xml:space="preserve"> </w:t>
       </w:r>
       <w:r>
-        <w:t xml:space="preserve">— premier à émettre la facture normalisée DGI sur la pièce.</w:t>
+        <w:t xml:space="preserve">: premier à émettre la facture normalisée DGI sur la pièce.</w:t>
       </w:r>
     </w:p>
     <w:bookmarkEnd w:id="16"/>
@@ -1984,7 +1972,7 @@
               <w:pStyle w:val="Compact"/>
             </w:pPr>
             <w:r>
-              <w:t xml:space="preserve">5–10 % côté vendeur, prélevée à l'escrow</w:t>
+              <w:t xml:space="preserve">5-10 % côté vendeur, prélevée à l'escrow</w:t>
             </w:r>
           </w:p>
         </w:tc>
@@ -2222,7 +2210,7 @@
           <w:b/>
           <w:bCs/>
         </w:rPr>
-        <w:t xml:space="preserve">25 000–60 000 F</w:t>
+        <w:t xml:space="preserve">25 000-60 000 F</w:t>
       </w:r>
       <w:r>
         <w:t xml:space="preserve">.</w:t>
@@ -2306,7 +2294,7 @@
           <w:b/>
           <w:bCs/>
         </w:rPr>
-        <w:t xml:space="preserve">M0–6 — Verrouiller Adjamé/Yopougon</w:t>
+        <w:t xml:space="preserve">M0-6, verrouiller Adjamé/Yopougon</w:t>
       </w:r>
       <w:r>
         <w:t xml:space="preserve"> </w:t>
@@ -2328,13 +2316,13 @@
           <w:b/>
           <w:bCs/>
         </w:rPr>
-        <w:t xml:space="preserve">M3–12 — Prendre le VTC</w:t>
-      </w:r>
-      <w:r>
-        <w:t xml:space="preserve"> </w:t>
-      </w:r>
-      <w:r>
-        <w:t xml:space="preserve">: partenariat Yango (pilote 200 conducteurs gratuits 3 mois → déploiement masse), Heetch en parallèle, démarchage des flottes indépendantes (5–200 véhicules), 3 cas clients chiffrés (-20 % budget pièces).</w:t>
+        <w:t xml:space="preserve">M3-12, prendre le VTC</w:t>
+      </w:r>
+      <w:r>
+        <w:t xml:space="preserve"> </w:t>
+      </w:r>
+      <w:r>
+        <w:t xml:space="preserve">: partenariat Yango (pilote 200 conducteurs gratuits 3 mois, puis déploiement de masse), Heetch en parallèle, démarchage des flottes indépendantes (5 à 200 véhicules), 3 cas clients chiffrés (-20 % budget pièces).</w:t>
       </w:r>
     </w:p>
     <w:p>
@@ -2350,13 +2338,13 @@
           <w:b/>
           <w:bCs/>
         </w:rPr>
-        <w:t xml:space="preserve">M6–15 — Devenir le standard FNE-CI</w:t>
-      </w:r>
-      <w:r>
-        <w:t xml:space="preserve"> </w:t>
-      </w:r>
-      <w:r>
-        <w:t xml:space="preserve">: intégration DGI, vente directe aux DAF (« vos chauffeurs achètent en cash → vous perdez la TVA »).</w:t>
+        <w:t xml:space="preserve">M6-15, devenir le standard FNE-CI</w:t>
+      </w:r>
+      <w:r>
+        <w:t xml:space="preserve"> </w:t>
+      </w:r>
+      <w:r>
+        <w:t xml:space="preserve">: intégration DGI, vente directe aux DAF (« vos chauffeurs achètent en cash, donc vous perdez la TVA »).</w:t>
       </w:r>
     </w:p>
     <w:p>
@@ -2372,7 +2360,7 @@
           <w:b/>
           <w:bCs/>
         </w:rPr>
-        <w:t xml:space="preserve">M12–18 — Étendre BTP / transport collectif / corporate</w:t>
+        <w:t xml:space="preserve">M12-18, étendre BTP / transport collectif / corporate</w:t>
       </w:r>
       <w:r>
         <w:t xml:space="preserve"> </w:t>
@@ -2394,13 +2382,13 @@
           <w:b/>
           <w:bCs/>
         </w:rPr>
-        <w:t xml:space="preserve">M18–24 — Sortir d'Abidjan</w:t>
-      </w:r>
-      <w:r>
-        <w:t xml:space="preserve"> </w:t>
-      </w:r>
-      <w:r>
-        <w:t xml:space="preserve">: Bouaké, San Pedro ; pilote sous-régional (Dakar/Cotonou).</w:t>
+        <w:t xml:space="preserve">M18-24, sortir d'Abidjan</w:t>
+      </w:r>
+      <w:r>
+        <w:t xml:space="preserve"> </w:t>
+      </w:r>
+      <w:r>
+        <w:t xml:space="preserve">: Bouaké, San Pedro, puis un pilote sous-régional (Dakar/Cotonou).</w:t>
       </w:r>
     </w:p>
     <w:p>
@@ -2827,7 +2815,7 @@
         <w:pStyle w:val="Heading2"/>
       </w:pPr>
       <w:r>
-        <w:t xml:space="preserve">9. La levée — combien, pourquoi, pour quoi</w:t>
+        <w:t xml:space="preserve">9. La levée : combien, pourquoi, pour quoi</w:t>
       </w:r>
     </w:p>
     <w:bookmarkStart w:id="20" w:name="X959eaac1a283f8adcc07af4c0e334e27d757517"/>
@@ -2897,29 +2885,29 @@
               <w:pStyle w:val="Compact"/>
             </w:pPr>
             <w:r>
-              <w:t xml:space="preserve">M0–6 (build + Adjamé)</w:t>
-            </w:r>
-          </w:p>
-        </w:tc>
-        <w:tc>
-          <w:tcPr/>
-          <w:p>
-            <w:pPr>
-              <w:pStyle w:val="Compact"/>
-            </w:pPr>
-            <w:r>
-              <w:t xml:space="preserve">M7–12 (VTC + monétisation)</w:t>
-            </w:r>
-          </w:p>
-        </w:tc>
-        <w:tc>
-          <w:tcPr/>
-          <w:p>
-            <w:pPr>
-              <w:pStyle w:val="Compact"/>
-            </w:pPr>
-            <w:r>
-              <w:t xml:space="preserve">M13–18 (scale)</w:t>
+              <w:t xml:space="preserve">M0-6 (build + Adjamé)</w:t>
+            </w:r>
+          </w:p>
+        </w:tc>
+        <w:tc>
+          <w:tcPr/>
+          <w:p>
+            <w:pPr>
+              <w:pStyle w:val="Compact"/>
+            </w:pPr>
+            <w:r>
+              <w:t xml:space="preserve">M7-12 (VTC + monétisation)</w:t>
+            </w:r>
+          </w:p>
+        </w:tc>
+        <w:tc>
+          <w:tcPr/>
+          <w:p>
+            <w:pPr>
+              <w:pStyle w:val="Compact"/>
+            </w:pPr>
+            <w:r>
+              <w:t xml:space="preserve">M13-18 (scale)</w:t>
             </w:r>
           </w:p>
         </w:tc>
@@ -3307,7 +3295,7 @@
               <w:pStyle w:val="Compact"/>
             </w:pPr>
             <w:r>
-              <w:t xml:space="preserve">~0–5 M</w:t>
+              <w:t xml:space="preserve">~0-5 M</w:t>
             </w:r>
           </w:p>
         </w:tc>
@@ -3318,17 +3306,17 @@
         <w:pStyle w:val="BodyText"/>
       </w:pPr>
       <w:r>
-        <w:t xml:space="preserve">Burn net opérationnel cumulé M0–18 ≈</w:t>
-      </w:r>
-      <w:r>
-        <w:t xml:space="preserve"> </w:t>
-      </w:r>
-      <w:r>
-        <w:rPr>
-          <w:b/>
-          <w:bCs/>
-        </w:rPr>
-        <w:t xml:space="preserve">300–350 M FCFA</w:t>
+        <w:t xml:space="preserve">Burn net opérationnel cumulé M0-18 ≈</w:t>
+      </w:r>
+      <w:r>
+        <w:t xml:space="preserve"> </w:t>
+      </w:r>
+      <w:r>
+        <w:rPr>
+          <w:b/>
+          <w:bCs/>
+        </w:rPr>
+        <w:t xml:space="preserve">300-350 M FCFA</w:t>
       </w:r>
       <w:r>
         <w:t xml:space="preserve">, auquel s'ajoutent le</w:t>
@@ -3347,7 +3335,7 @@
         <w:t xml:space="preserve"> </w:t>
       </w:r>
       <w:r>
-        <w:t xml:space="preserve">(stock tampon SLA, ~100–150 M F), un</w:t>
+        <w:t xml:space="preserve">(stock tampon SLA, ~100-150 M F), un</w:t>
       </w:r>
       <w:r>
         <w:t xml:space="preserve"> </w:t>
@@ -3363,7 +3351,7 @@
         <w:t xml:space="preserve"> </w:t>
       </w:r>
       <w:r>
-        <w:t xml:space="preserve">(~150–200 M F) et une réserve de préparation Série A.</w:t>
+        <w:t xml:space="preserve">(~150-200 M F) et une réserve de préparation Série A.</w:t>
       </w:r>
     </w:p>
     <w:bookmarkEnd w:id="20"/>
@@ -3471,7 +3459,7 @@
               <w:pStyle w:val="Compact"/>
             </w:pPr>
             <w:r>
-              <w:t xml:space="preserve">~14–16 mois</w:t>
+              <w:t xml:space="preserve">~14-16 mois</w:t>
             </w:r>
           </w:p>
         </w:tc>
@@ -3529,7 +3517,7 @@
                 <w:b/>
                 <w:bCs/>
               </w:rPr>
-              <w:t xml:space="preserve">~20–24 mois</w:t>
+              <w:t xml:space="preserve">~20-24 mois</w:t>
             </w:r>
           </w:p>
         </w:tc>
@@ -3910,13 +3898,13 @@
           <w:b/>
           <w:bCs/>
         </w:rPr>
-        <w:t xml:space="preserve">Série A 4–7 M USD</w:t>
-      </w:r>
-      <w:r>
-        <w:t xml:space="preserve"> </w:t>
-      </w:r>
-      <w:r>
-        <w:t xml:space="preserve">visée à M15–18 pour l'expansion nationale et sous-régionale.</w:t>
+        <w:t xml:space="preserve">Série A 4-7 M USD</w:t>
+      </w:r>
+      <w:r>
+        <w:t xml:space="preserve"> </w:t>
+      </w:r>
+      <w:r>
+        <w:t xml:space="preserve">visée à M15-18 pour l'expansion nationale et sous-régionale.</w:t>
       </w:r>
     </w:p>
     <w:bookmarkEnd w:id="23"/>
@@ -3953,7 +3941,7 @@
         <w:pStyle w:val="FirstParagraph"/>
       </w:pPr>
       <w:r>
-        <w:t xml:space="preserve">Recrutements prioritaires M0–M3 :</w:t>
+        <w:t xml:space="preserve">Recrutements prioritaires M0-M3 :</w:t>
       </w:r>
       <w:r>
         <w:t xml:space="preserve"> </w:t>
@@ -4312,10 +4300,7 @@
         <w:t xml:space="preserve"> </w:t>
       </w:r>
       <w:r>
-        <w:t xml:space="preserve">ne combine la marketplace consommateur, la plateforme flotte B2B et le réseau terrain Liaison ; personne n'a la conformité FNE-CI native ni la base fitments Côte d'Ivoire que nous construisons transaction par transaction. Ces trois éléments —</w:t>
-      </w:r>
-      <w:r>
-        <w:t xml:space="preserve"> </w:t>
+        <w:t xml:space="preserve">ne combine la marketplace consommateur, la plateforme flotte B2B et le réseau terrain Liaison ; personne n'a la conformité FNE-CI native ni la base fitments Côte d'Ivoire que nous construisons transaction par transaction. Ces trois éléments (</w:t>
       </w:r>
       <w:r>
         <w:rPr>
@@ -4325,10 +4310,7 @@
         <w:t xml:space="preserve">demande, offre, conformité</w:t>
       </w:r>
       <w:r>
-        <w:t xml:space="preserve"> </w:t>
-      </w:r>
-      <w:r>
-        <w:t xml:space="preserve">— forment un monopole défendable à 36 mois si l'exécution est tenue.</w:t>
+        <w:t xml:space="preserve">) forment un monopole défendable à 36 mois si l'exécution est tenue.</w:t>
       </w:r>
       <w:r>
         <w:t xml:space="preserve"> </w:t>
@@ -4357,7 +4339,7 @@
           <w:i/>
           <w:iCs/>
         </w:rPr>
-        <w:t xml:space="preserve">Pièces — la pièce qu'il te faut, au juste prix, livrée et garantie. · Document interne confidentiel · Plan d'affaires v1.1 · Juin 2026. Sources marché : étude Pièces « Coûts d'exploitation VTC en Côte d'Ivoire » (mai 2026), Déclic Car / 7info &amp; Digital Mag CI (Yango : 25 000 véhicules, 100 000 courses/jour, 160 entreprises — 2026), Africa Data Intelligence (VTC 2024), Ministère des Transports CI (parc ~1,2 M, 2022), Agence Ecofin &amp; Jeune Afrique (retrait Uber 2025), Disrupt Africa / TechCabal (financement 2024–2025). Chiffres financiers : projections internes à valider sur données réelles.</w:t>
+        <w:t xml:space="preserve">Pièces : la pièce qu'il te faut, au juste prix, livrée et garantie. · Document interne confidentiel · Plan d'affaires v1.1 · Juin 2026. Sources marché : étude Pièces « Coûts d'exploitation VTC en Côte d'Ivoire » (mai 2026), Déclic Car / 7info &amp; Digital Mag CI (Yango : 25 000 véhicules, 100 000 courses/jour, 160 entreprises, 2026), Africa Data Intelligence (VTC 2024), Ministère des Transports CI (parc ~1,2 M, 2022), Agence Ecofin &amp; Jeune Afrique (retrait Uber 2025), Disrupt Africa / TechCabal (financement 2024-2025). Chiffres financiers : projections internes à valider sur données réelles.</w:t>
       </w:r>
     </w:p>
     <w:bookmarkEnd w:id="28"/>

</xml_diff>

<commit_message>
docs(plan): pre-seed, paiement à la livraison, commission 7-15 %, concurrence enrichie
- Reformule le tour en Pre-seed (jalon suivant = Seed, plus Série A)
- Passe le modèle de paiement à « paiement à la livraison » (escrow retiré)
- Marché « principalement » et non 100 % informel
- Commission marketplace 7-15 %, prélevée au paiement acheteur
- fitment → compatibilité partout ; concurrence enrichie (cartographie juin 2026)
- v1.1 → v1.2

Co-Authored-By: Claude Opus 4.8 (1M context) <noreply@anthropic.com>
</commit_message>
<xml_diff>
--- a/docs/plan-affaires-pieces-2026-06.docx
+++ b/docs/plan-affaires-pieces-2026-06.docx
@@ -54,20 +54,20 @@
         <w:t xml:space="preserve"> </w:t>
       </w:r>
       <w:r>
-        <w:t xml:space="preserve">: le mécanicien identifie la pièce (recherche, photo IA, VIN), le propriétaire paie en Mobile Money via</w:t>
-      </w:r>
-      <w:r>
-        <w:t xml:space="preserve"> </w:t>
-      </w:r>
-      <w:r>
-        <w:rPr>
-          <w:b/>
-          <w:bCs/>
-        </w:rPr>
-        <w:t xml:space="preserve">escrow</w:t>
-      </w:r>
-      <w:r>
-        <w:t xml:space="preserve">, le vendeur livre. Prix affiché, condition de la pièce affichée (chip Neuf / Occasion / Ré-usiné / Aftermarket / OEM), garantie, facture.</w:t>
+        <w:t xml:space="preserve">: le mécanicien identifie la pièce (recherche, photo IA, VIN), le vendeur livre, le propriétaire</w:t>
+      </w:r>
+      <w:r>
+        <w:t xml:space="preserve"> </w:t>
+      </w:r>
+      <w:r>
+        <w:rPr>
+          <w:b/>
+          <w:bCs/>
+        </w:rPr>
+        <w:t xml:space="preserve">paie à la livraison</w:t>
+      </w:r>
+      <w:r>
+        <w:t xml:space="preserve">. Prix affiché, condition de la pièce affichée (chip Neuf / Occasion / Ré-usiné / Aftermarket / OEM), garantie, facture.</w:t>
       </w:r>
     </w:p>
     <w:p>
@@ -207,7 +207,7 @@
         <w:t xml:space="preserve"> </w:t>
       </w:r>
       <w:r>
-        <w:t xml:space="preserve">: marketplace, escrow, dashboard flotte, calculateur ROI, bot WhatsApp, et un catalogue de</w:t>
+        <w:t xml:space="preserve">: marketplace, paiement à la livraison, dashboard flotte, calculateur ROI, bot WhatsApp, et un catalogue de</w:t>
       </w:r>
       <w:r>
         <w:t xml:space="preserve"> </w:t>
@@ -223,7 +223,7 @@
         <w:t xml:space="preserve"> </w:t>
       </w:r>
       <w:r>
-        <w:t xml:space="preserve">déjà ingérées (sources Jumia, CoinAfrique, global-auto). Le portail entreprise est en ligne sur</w:t>
+        <w:t xml:space="preserve">déjà ingérées. Le portail entreprise est en ligne sur</w:t>
       </w:r>
       <w:r>
         <w:t xml:space="preserve"> </w:t>
@@ -263,13 +263,13 @@
           <w:b/>
           <w:bCs/>
         </w:rPr>
-        <w:t xml:space="preserve">Seed de ~1,5 M USD (≈ 900 M FCFA)</w:t>
-      </w:r>
-      <w:r>
-        <w:t xml:space="preserve"> </w:t>
-      </w:r>
-      <w:r>
-        <w:t xml:space="preserve">pour financer 18 à 24 mois d'exécution : verrouiller Adjamé, prendre la verticale VTC via un partenariat Yango et atteindre les jalons d'une Série A.</w:t>
+        <w:t xml:space="preserve">Pre-seed de ~1,5 M USD (≈ 900 M FCFA)</w:t>
+      </w:r>
+      <w:r>
+        <w:t xml:space="preserve"> </w:t>
+      </w:r>
+      <w:r>
+        <w:t xml:space="preserve">pour financer 18 à 24 mois d'exécution : verrouiller le catalogue de 90 % des pièces du marché, prendre la verticale VTC via un partenariat Yango et atteindre les jalons d'un Seed.</w:t>
       </w:r>
     </w:p>
     <w:bookmarkEnd w:id="9"/>
@@ -297,13 +297,13 @@
           <w:b/>
           <w:bCs/>
         </w:rPr>
-        <w:t xml:space="preserve">100 % informel</w:t>
-      </w:r>
-      <w:r>
-        <w:t xml:space="preserve"> </w:t>
-      </w:r>
-      <w:r>
-        <w:t xml:space="preserve">: des milliers de vendeurs (magasins d'Adjamé, Yopougon, Marcory) vendent sans catalogue, sans prix affiché, sans garantie, sans facture, sans traçabilité.</w:t>
+        <w:t xml:space="preserve">principalement informel</w:t>
+      </w:r>
+      <w:r>
+        <w:t xml:space="preserve"> </w:t>
+      </w:r>
+      <w:r>
+        <w:t xml:space="preserve">: quelques acteurs sont en ligne, mais l'immense majorité des vendeurs (magasins d'Adjamé, Yopougon, Marcory) vendent sans catalogue, sans prix affiché, sans garantie, sans facture, sans traçabilité.</w:t>
       </w:r>
     </w:p>
     <w:p>
@@ -545,7 +545,7 @@
                 <w:b/>
                 <w:bCs/>
               </w:rPr>
-              <w:t xml:space="preserve">Marketplace + escrow Mobile Money</w:t>
+              <w:t xml:space="preserve">Marketplace + Garantie</w:t>
             </w:r>
           </w:p>
         </w:tc>
@@ -595,7 +595,7 @@
               <w:pStyle w:val="Compact"/>
             </w:pPr>
             <w:r>
-              <w:t xml:space="preserve">Identification fiable, fitment véhicule CI</w:t>
+              <w:t xml:space="preserve">Identification fiable, compatibilité véhicule CI</w:t>
             </w:r>
           </w:p>
         </w:tc>
@@ -807,24 +807,6 @@
         </w:tc>
       </w:tr>
     </w:tbl>
-    <w:p>
-      <w:pPr>
-        <w:pStyle w:val="BodyText"/>
-      </w:pPr>
-      <w:r>
-        <w:rPr>
-          <w:b/>
-          <w:bCs/>
-        </w:rPr>
-        <w:t xml:space="preserve">Les non-négociables produit</w:t>
-      </w:r>
-      <w:r>
-        <w:t xml:space="preserve"> </w:t>
-      </w:r>
-      <w:r>
-        <w:t xml:space="preserve">: chips de condition partout (jamais en gris), breakdown de prix explicite avant paiement, tout en français, devise FCFA.</w:t>
-      </w:r>
-    </w:p>
     <w:bookmarkEnd w:id="11"/>
     <w:bookmarkStart w:id="15" w:name="X6951ad93043e47a813837d5552068bb4799b175"/>
     <w:p>
@@ -1482,7 +1464,7 @@
         <w:t xml:space="preserve">~1,3 M FCFA/véh/an</w:t>
       </w:r>
       <w:r>
-        <w:t xml:space="preserve">), et chaque jour d'immobilisation détruit directement du revenu (15 000-30 000 F/jour). La douleur est aiguë, récurrente et mesurable : idéale pour prouver le ROI, bâtir les cas clients et la base de données fitments avant d'étendre au parc entier.</w:t>
+        <w:t xml:space="preserve">), et chaque jour d'immobilisation détruit directement du revenu (15 000-30 000 F/jour). La douleur est aiguë, récurrente et mesurable : idéale pour prouver le ROI, bâtir les cas clients et la base de données de compatibilité avant d'étendre au parc entier.</w:t>
       </w:r>
       <w:r>
         <w:t xml:space="preserve"> </w:t>
@@ -1510,7 +1492,7 @@
         <w:pStyle w:val="FirstParagraph"/>
       </w:pPr>
       <w:r>
-        <w:t xml:space="preserve">Quatre tendances poussent dans le même sens : la restriction de l'âge des véhicules importés, le rajeunissement du parc, la montée du Mobile Money (Orange Money, MTN, Wave) et la formalisation fiscale (FNE-CI). L'après-vente automobile se digitalise, et le moment d'entrer, c'est</w:t>
+        <w:t xml:space="preserve">Quatre tendances poussent dans le même sens : la restriction de l'âge des véhicules importés, le rajeunissement du parc, la digitalisation accrue des moyens de paiement et la formalisation fiscale (FNE-CI). L'après-vente automobile se digitalise, et le moment d'entrer, c'est</w:t>
       </w:r>
       <w:r>
         <w:t xml:space="preserve"> </w:t>
@@ -1637,29 +1619,35 @@
                 <w:b/>
                 <w:bCs/>
               </w:rPr>
-              <w:t xml:space="preserve">global-auto.online</w:t>
-            </w:r>
-          </w:p>
-        </w:tc>
-        <w:tc>
-          <w:tcPr/>
-          <w:p>
-            <w:pPr>
-              <w:pStyle w:val="Compact"/>
-            </w:pPr>
-            <w:r>
-              <w:t xml:space="preserve">Seul catalogue web structuré</w:t>
-            </w:r>
-          </w:p>
-        </w:tc>
-        <w:tc>
-          <w:tcPr/>
-          <w:p>
-            <w:pPr>
-              <w:pStyle w:val="Compact"/>
-            </w:pPr>
-            <w:r>
-              <w:t xml:space="preserve">Catalogue miroité (veille prix permanente) ; ils ne voient pas nos prix</w:t>
+              <w:t xml:space="preserve">Sites e-commerce locaux</w:t>
+            </w:r>
+            <w:r>
+              <w:t xml:space="preserve"> </w:t>
+            </w:r>
+            <w:r>
+              <w:t xml:space="preserve">(global-auto, MobriStore, MAPA-CI, EasyPieces, OK Pièces, Lakasse, s-automeca…)</w:t>
+            </w:r>
+          </w:p>
+        </w:tc>
+        <w:tc>
+          <w:tcPr/>
+          <w:p>
+            <w:pPr>
+              <w:pStyle w:val="Compact"/>
+            </w:pPr>
+            <w:r>
+              <w:t xml:space="preserve">Catalogues web fragmentés et étroits</w:t>
+            </w:r>
+          </w:p>
+        </w:tc>
+        <w:tc>
+          <w:tcPr/>
+          <w:p>
+            <w:pPr>
+              <w:pStyle w:val="Compact"/>
+            </w:pPr>
+            <w:r>
+              <w:t xml:space="preserve">Catalogues miroités ; nous agrégeons et normalisons tout le marché, eux ne voient pas nos prix</w:t>
             </w:r>
           </w:p>
         </w:tc>
@@ -1698,7 +1686,7 @@
               <w:pStyle w:val="Compact"/>
             </w:pPr>
             <w:r>
-              <w:t xml:space="preserve">Avance terrain + data fitments à industrialiser vite</w:t>
+              <w:t xml:space="preserve">Avance terrain + compatibilité des données à industrialiser vite</w:t>
             </w:r>
           </w:p>
         </w:tc>
@@ -1787,6 +1775,46 @@
         <w:pStyle w:val="BodyText"/>
       </w:pPr>
       <w:r>
+        <w:t xml:space="preserve">Notre cartographie terrain et technique de juin 2026 recense</w:t>
+      </w:r>
+      <w:r>
+        <w:t xml:space="preserve"> </w:t>
+      </w:r>
+      <w:r>
+        <w:rPr>
+          <w:b/>
+          <w:bCs/>
+        </w:rPr>
+        <w:t xml:space="preserve">plus d'une dizaine de sites locaux</w:t>
+      </w:r>
+      <w:r>
+        <w:t xml:space="preserve"> </w:t>
+      </w:r>
+      <w:r>
+        <w:t xml:space="preserve">(EasyPieces, OK Pièces Auto, MAPA-CI, General Auto Parts, MobriStore, Lakasse, s-automeca, global-auto…). Aucun ne combine largeur de catalogue, prix affichés et compatibilité véhicule : Lakasse expose 21 références, s-automeca affiche 11 750 produits mais</w:t>
+      </w:r>
+      <w:r>
+        <w:t xml:space="preserve"> </w:t>
+      </w:r>
+      <w:r>
+        <w:rPr>
+          <w:b/>
+          <w:bCs/>
+        </w:rPr>
+        <w:t xml:space="preserve">sans prix</w:t>
+      </w:r>
+      <w:r>
+        <w:t xml:space="preserve"> </w:t>
+      </w:r>
+      <w:r>
+        <w:t xml:space="preserve">(sur demande), et la plupart n'ont ni API ni catalogue structuré. Le marché reste entièrement à agréger.</w:t>
+      </w:r>
+    </w:p>
+    <w:p>
+      <w:pPr>
+        <w:pStyle w:val="BodyText"/>
+      </w:pPr>
+      <w:r>
         <w:rPr>
           <w:b/>
           <w:bCs/>
@@ -1829,7 +1857,7 @@
           <w:b/>
           <w:bCs/>
         </w:rPr>
-        <w:t xml:space="preserve">La data fitments Côte d'Ivoire</w:t>
+        <w:t xml:space="preserve">La compatibilité des données Côte d'Ivoire</w:t>
       </w:r>
       <w:r>
         <w:t xml:space="preserve"> </w:t>
@@ -1851,7 +1879,7 @@
           <w:b/>
           <w:bCs/>
         </w:rPr>
-        <w:t xml:space="preserve">L'escrow Mobile Money et la garantie Pièces</w:t>
+        <w:t xml:space="preserve">Le paiement à la livraison et la garantie Pièces</w:t>
       </w:r>
       <w:r>
         <w:t xml:space="preserve"> </w:t>
@@ -1972,7 +2000,7 @@
               <w:pStyle w:val="Compact"/>
             </w:pPr>
             <w:r>
-              <w:t xml:space="preserve">5-10 % côté vendeur, prélevée à l'escrow</w:t>
+              <w:t xml:space="preserve">7-15 %, prélevée au moment du paiement par l'acheteur</w:t>
             </w:r>
           </w:p>
         </w:tc>
@@ -2150,7 +2178,7 @@
           <w:b/>
           <w:bCs/>
         </w:rPr>
-        <w:t xml:space="preserve">8 %</w:t>
+        <w:t xml:space="preserve">10 %</w:t>
       </w:r>
       <w:r>
         <w:t xml:space="preserve"> </w:t>
@@ -2166,7 +2194,7 @@
           <w:b/>
           <w:bCs/>
         </w:rPr>
-        <w:t xml:space="preserve">2 560 F</w:t>
+        <w:t xml:space="preserve">3 200 F</w:t>
       </w:r>
       <w:r>
         <w:t xml:space="preserve"> </w:t>
@@ -2294,13 +2322,13 @@
           <w:b/>
           <w:bCs/>
         </w:rPr>
-        <w:t xml:space="preserve">M0-6, verrouiller Adjamé/Yopougon</w:t>
-      </w:r>
-      <w:r>
-        <w:t xml:space="preserve"> </w:t>
-      </w:r>
-      <w:r>
-        <w:t xml:space="preserve">: 20 Liaisons, 300 vendeurs onboardés, 30 000 pièces publiées, 350 commandes/jour à M6.</w:t>
+        <w:t xml:space="preserve">M0-6, verrouiller les principaux vendeurs</w:t>
+      </w:r>
+      <w:r>
+        <w:t xml:space="preserve"> </w:t>
+      </w:r>
+      <w:r>
+        <w:t xml:space="preserve">: 85 à 90 % des pièces du marché enregistrées, 20 Liaisons, 300 vendeurs onboardés, 350 commandes/jour à M6.</w:t>
       </w:r>
     </w:p>
     <w:p>
@@ -2344,7 +2372,7 @@
         <w:t xml:space="preserve"> </w:t>
       </w:r>
       <w:r>
-        <w:t xml:space="preserve">: intégration DGI, vente directe aux DAF (« vos chauffeurs achètent en cash, donc vous perdez la TVA »).</w:t>
+        <w:t xml:space="preserve">: intégration DGI, vente directe aux DAF (« nous vous aidons à récupérer la TVA que vous perdez aujourd'hui »).</w:t>
       </w:r>
     </w:p>
     <w:p>
@@ -2848,7 +2876,7 @@
         <w:t xml:space="preserve"> </w:t>
       </w:r>
       <w:r>
-        <w:t xml:space="preserve">d'exécution jusqu'aux jalons d'une Série A. Construction du burn mensuel (FCFA) :</w:t>
+        <w:t xml:space="preserve">d'exécution jusqu'aux jalons d'un Seed. Construction du burn mensuel (FCFA) :</w:t>
       </w:r>
     </w:p>
     <w:tbl>
@@ -3351,7 +3379,7 @@
         <w:t xml:space="preserve"> </w:t>
       </w:r>
       <w:r>
-        <w:t xml:space="preserve">(~150-200 M F) et une réserve de préparation Série A.</w:t>
+        <w:t xml:space="preserve">(~150-200 M F) et une réserve de préparation du tour Seed.</w:t>
       </w:r>
     </w:p>
     <w:bookmarkEnd w:id="20"/>
@@ -3528,7 +3556,7 @@
               <w:pStyle w:val="Compact"/>
             </w:pPr>
             <w:r>
-              <w:t xml:space="preserve">Atteint les jalons Série A avec coussin</w:t>
+              <w:t xml:space="preserve">Atteint les jalons du Seed avec coussin</w:t>
             </w:r>
           </w:p>
         </w:tc>
@@ -3840,13 +3868,13 @@
       </w:tr>
     </w:tbl>
     <w:bookmarkEnd w:id="22"/>
-    <w:bookmarkStart w:id="23" w:name="X34f76f6bb1a57270b17d02c9539ecf96603979b"/>
+    <w:bookmarkStart w:id="23" w:name="X7573fb0b7e799144dc698ef2cf9361c4547125b"/>
     <w:p>
       <w:pPr>
         <w:pStyle w:val="Heading3"/>
       </w:pPr>
       <w:r>
-        <w:t xml:space="preserve">9.4 Jalons débloqués (conditions de la Série A)</w:t>
+        <w:t xml:space="preserve">9.4 Jalons débloqués (conditions du Seed)</w:t>
       </w:r>
     </w:p>
     <w:p>
@@ -3898,13 +3926,13 @@
           <w:b/>
           <w:bCs/>
         </w:rPr>
-        <w:t xml:space="preserve">Série A 4-7 M USD</w:t>
-      </w:r>
-      <w:r>
-        <w:t xml:space="preserve"> </w:t>
-      </w:r>
-      <w:r>
-        <w:t xml:space="preserve">visée à M15-18 pour l'expansion nationale et sous-régionale.</w:t>
+        <w:t xml:space="preserve">Seed 4-7 M USD</w:t>
+      </w:r>
+      <w:r>
+        <w:t xml:space="preserve"> </w:t>
+      </w:r>
+      <w:r>
+        <w:t xml:space="preserve">visé à M15-18 pour l'expansion nationale et sous-régionale.</w:t>
       </w:r>
     </w:p>
     <w:bookmarkEnd w:id="23"/>
@@ -4088,7 +4116,7 @@
               <w:pStyle w:val="Compact"/>
             </w:pPr>
             <w:r>
-              <w:t xml:space="preserve">Verrouillage 12 mois, exclusivité partielle top vendeurs, data fitments propriétaire</w:t>
+              <w:t xml:space="preserve">Verrouillage 12 mois, exclusivité partielle top vendeurs, compatibilité des données propriétaire</w:t>
             </w:r>
           </w:p>
         </w:tc>
@@ -4206,29 +4234,29 @@
               <w:pStyle w:val="Compact"/>
             </w:pPr>
             <w:r>
-              <w:t xml:space="preserve">Dépendance Mobile Money (panne PSP)</w:t>
-            </w:r>
-          </w:p>
-        </w:tc>
-        <w:tc>
-          <w:tcPr/>
-          <w:p>
-            <w:pPr>
-              <w:pStyle w:val="Compact"/>
-            </w:pPr>
-            <w:r>
-              <w:t xml:space="preserve">Élevé temporaire</w:t>
-            </w:r>
-          </w:p>
-        </w:tc>
-        <w:tc>
-          <w:tcPr/>
-          <w:p>
-            <w:pPr>
-              <w:pStyle w:val="Compact"/>
-            </w:pPr>
-            <w:r>
-              <w:t xml:space="preserve">Multi-PSP (CinetPay + Wave + OM/MTN), fallback COD</w:t>
+              <w:t xml:space="preserve">Encaissement à la livraison (impayé, client absent)</w:t>
+            </w:r>
+          </w:p>
+        </w:tc>
+        <w:tc>
+          <w:tcPr/>
+          <w:p>
+            <w:pPr>
+              <w:pStyle w:val="Compact"/>
+            </w:pPr>
+            <w:r>
+              <w:t xml:space="preserve">Moyen</w:t>
+            </w:r>
+          </w:p>
+        </w:tc>
+        <w:tc>
+          <w:tcPr/>
+          <w:p>
+            <w:pPr>
+              <w:pStyle w:val="Compact"/>
+            </w:pPr>
+            <w:r>
+              <w:t xml:space="preserve">Confirmation de commande avant départ du livreur, acompte sur grosses pièces, encaissement cash ou Mobile Money à la remise</w:t>
             </w:r>
           </w:p>
         </w:tc>
@@ -4263,7 +4291,7 @@
               <w:pStyle w:val="Compact"/>
             </w:pPr>
             <w:r>
-              <w:t xml:space="preserve">Revue cash mensuelle, jalons Série A clairs, scénario downside runway 18 mois</w:t>
+              <w:t xml:space="preserve">Revue cash mensuelle, jalons Seed clairs, scénario downside runway 18 mois</w:t>
             </w:r>
           </w:p>
         </w:tc>
@@ -4300,7 +4328,7 @@
         <w:t xml:space="preserve"> </w:t>
       </w:r>
       <w:r>
-        <w:t xml:space="preserve">ne combine la marketplace consommateur, la plateforme flotte B2B et le réseau terrain Liaison ; personne n'a la conformité FNE-CI native ni la base fitments Côte d'Ivoire que nous construisons transaction par transaction. Ces trois éléments (</w:t>
+        <w:t xml:space="preserve">ne combine la marketplace consommateur, la plateforme flotte B2B et le réseau terrain Liaison ; personne n'a la conformité FNE-CI native ni la base de compatibilité Côte d'Ivoire que nous construisons transaction par transaction. Ces trois éléments (</w:t>
       </w:r>
       <w:r>
         <w:rPr>
@@ -4339,7 +4367,7 @@
           <w:i/>
           <w:iCs/>
         </w:rPr>
-        <w:t xml:space="preserve">Pièces : la pièce qu'il te faut, au juste prix, livrée et garantie. · Document interne confidentiel · Plan d'affaires v1.1 · Juin 2026. Sources marché : étude Pièces « Coûts d'exploitation VTC en Côte d'Ivoire » (mai 2026), Déclic Car / 7info &amp; Digital Mag CI (Yango : 25 000 véhicules, 100 000 courses/jour, 160 entreprises, 2026), Africa Data Intelligence (VTC 2024), Ministère des Transports CI (parc ~1,2 M, 2022), Agence Ecofin &amp; Jeune Afrique (retrait Uber 2025), Disrupt Africa / TechCabal (financement 2024-2025). Chiffres financiers : projections internes à valider sur données réelles.</w:t>
+        <w:t xml:space="preserve">Pièces : la pièce qu'il te faut, au juste prix, livrée et garantie. · Document interne confidentiel · Plan d'affaires v1.2 · Juin 2026. Sources marché : étude Pièces « Coûts d'exploitation VTC en Côte d'Ivoire » (mai 2026), Déclic Car / 7info &amp; Digital Mag CI (Yango : 25 000 véhicules, 100 000 courses/jour, 160 entreprises, 2026), Africa Data Intelligence (VTC 2024), Ministère des Transports CI (parc ~1,2 M, 2022), Agence Ecofin &amp; Jeune Afrique (retrait Uber 2025), Disrupt Africa / TechCabal (financement 2024-2025). Chiffres financiers : projections internes à valider sur données réelles.</w:t>
       </w:r>
     </w:p>
     <w:bookmarkEnd w:id="28"/>

</xml_diff>

<commit_message>
docs(plan): levée ramenée à ~1 M EUR, retrait WhatsApp/Gemini/sources, ajustements problème & canaux
- Tour Pre-seed reconverti en EUR (~1 M EUR ≈ 655 M FCFA), scénarios + emploi des fonds recalculés
- Hypothèse change 1 EUR ≈ 656 FCFA ; prochain tour Seed 4-6 M EUR
- Problème : « garanties diverses », flotte 25 000-50 000 F/jour
- Produit : retrait « Gemini », « Bot conversationnel » (sans WhatsApp), « vendeurs » (sans informels)
- Canaux d'acquisition reformulés (commerciaux, réseaux sociaux, télé)
- §12 : digitalisation des vendeurs de pièces (remplace réseau terrain Liaison)
- Retrait du bloc Sources marché ; v1.2 → v1.3

Co-Authored-By: Claude Opus 4.8 (1M context) <noreply@anthropic.com>
</commit_message>
<xml_diff>
--- a/docs/plan-affaires-pieces-2026-06.docx
+++ b/docs/plan-affaires-pieces-2026-06.docx
@@ -207,7 +207,7 @@
         <w:t xml:space="preserve"> </w:t>
       </w:r>
       <w:r>
-        <w:t xml:space="preserve">: marketplace, paiement à la livraison, dashboard flotte, calculateur ROI, bot WhatsApp, et un catalogue de</w:t>
+        <w:t xml:space="preserve">: marketplace, paiement à la livraison, dashboard flotte, calculateur ROI, bot conversationnel, et un catalogue de</w:t>
       </w:r>
       <w:r>
         <w:t xml:space="preserve"> </w:t>
@@ -263,13 +263,13 @@
           <w:b/>
           <w:bCs/>
         </w:rPr>
-        <w:t xml:space="preserve">Pre-seed de ~1,5 M USD (≈ 900 M FCFA)</w:t>
-      </w:r>
-      <w:r>
-        <w:t xml:space="preserve"> </w:t>
-      </w:r>
-      <w:r>
-        <w:t xml:space="preserve">pour financer 18 à 24 mois d'exécution : verrouiller le catalogue de 90 % des pièces du marché, prendre la verticale VTC via un partenariat Yango et atteindre les jalons d'un Seed.</w:t>
+        <w:t xml:space="preserve">Pre-seed de ~1 M EUR (≈ 655 M FCFA)</w:t>
+      </w:r>
+      <w:r>
+        <w:t xml:space="preserve"> </w:t>
+      </w:r>
+      <w:r>
+        <w:t xml:space="preserve">pour financer 18 à 20 mois d'exécution : verrouiller le catalogue de 90 % des pièces du marché, prendre la verticale VTC via un partenariat Yango et atteindre les jalons d'un Seed.</w:t>
       </w:r>
     </w:p>
     <w:bookmarkEnd w:id="9"/>
@@ -303,7 +303,7 @@
         <w:t xml:space="preserve"> </w:t>
       </w:r>
       <w:r>
-        <w:t xml:space="preserve">: quelques acteurs sont en ligne, mais l'immense majorité des vendeurs (magasins d'Adjamé, Yopougon, Marcory) vendent sans catalogue, sans prix affiché, sans garantie, sans facture, sans traçabilité.</w:t>
+        <w:t xml:space="preserve">: quelques acteurs sont en ligne, mais l'immense majorité des vendeurs (magasins d'Adjamé, Yopougon, Marcory) vendent sans catalogue, sans prix affiché et avec des garanties diverses.</w:t>
       </w:r>
     </w:p>
     <w:p>
@@ -381,7 +381,7 @@
           <w:b/>
           <w:bCs/>
         </w:rPr>
-        <w:t xml:space="preserve">30 000 à 50 000 FCFA par jour et par véhicule immobilisé</w:t>
+        <w:t xml:space="preserve">25 000 à 50 000 FCFA par jour et par véhicule immobilisé</w:t>
       </w:r>
       <w:r>
         <w:t xml:space="preserve">, et ne sait pas où part son budget pièces.</w:t>
@@ -584,7 +584,7 @@
                 <w:b/>
                 <w:bCs/>
               </w:rPr>
-              <w:t xml:space="preserve">Recherche pièce (texte / photo IA Gemini / VIN)</w:t>
+              <w:t xml:space="preserve">Recherche pièce (texte / photo IA / VIN)</w:t>
             </w:r>
           </w:p>
         </w:tc>
@@ -701,18 +701,18 @@
                 <w:b/>
                 <w:bCs/>
               </w:rPr>
-              <w:t xml:space="preserve">Bot WhatsApp</w:t>
-            </w:r>
-          </w:p>
-        </w:tc>
-        <w:tc>
-          <w:tcPr/>
-          <w:p>
-            <w:pPr>
-              <w:pStyle w:val="Compact"/>
-            </w:pPr>
-            <w:r>
-              <w:t xml:space="preserve">Canal d'entrée n°1 pour non-équipés</w:t>
+              <w:t xml:space="preserve">Bot conversationnel</w:t>
+            </w:r>
+          </w:p>
+        </w:tc>
+        <w:tc>
+          <w:tcPr/>
+          <w:p>
+            <w:pPr>
+              <w:pStyle w:val="Compact"/>
+            </w:pPr>
+            <w:r>
+              <w:t xml:space="preserve">Canal d'entrée n°1</w:t>
             </w:r>
           </w:p>
         </w:tc>
@@ -751,7 +751,7 @@
               <w:pStyle w:val="Compact"/>
             </w:pPr>
             <w:r>
-              <w:t xml:space="preserve">Onboarding vendeurs informels à grande échelle</w:t>
+              <w:t xml:space="preserve">Onboarding vendeurs à grande échelle</w:t>
             </w:r>
           </w:p>
         </w:tc>
@@ -2424,7 +2424,7 @@
         <w:pStyle w:val="FirstParagraph"/>
       </w:pPr>
       <w:r>
-        <w:t xml:space="preserve">Canaux d'acquisition : Liaison terrain (80 % du sourcing offre), WhatsApp &amp; radio populaire (demande), vente directe B2B (account executives), partenariats plateformes VTC, prescription experts-comptables/DAF.</w:t>
+        <w:t xml:space="preserve">Canaux d'acquisition : commerciaux, Liaison terrain, réseaux sociaux, télé (demande), vente directe B2B (account executives), partenariats plateformes VTC, prescription experts-comptables/DAF.</w:t>
       </w:r>
     </w:p>
     <w:bookmarkEnd w:id="18"/>
@@ -2442,7 +2442,7 @@
         <w:pStyle w:val="FirstParagraph"/>
       </w:pPr>
       <w:r>
-        <w:t xml:space="preserve">Hypothèses : 1 USD ≈ 600 FCFA. Lancement commercial H2 2026. Chiffres en projections, à valider sur données réelles.</w:t>
+        <w:t xml:space="preserve">Hypothèses : 1 EUR ≈ 656 FCFA. Lancement commercial H2 2026. Chiffres en projections, à valider sur données réelles.</w:t>
       </w:r>
     </w:p>
     <w:tbl>
@@ -2870,7 +2870,7 @@
           <w:b/>
           <w:bCs/>
         </w:rPr>
-        <w:t xml:space="preserve">18 à 24 mois</w:t>
+        <w:t xml:space="preserve">18 à 20 mois</w:t>
       </w:r>
       <w:r>
         <w:t xml:space="preserve"> </w:t>
@@ -3476,18 +3476,18 @@
               <w:pStyle w:val="Compact"/>
             </w:pPr>
             <w:r>
-              <w:t xml:space="preserve">~1,0 M USD (600 M F)</w:t>
-            </w:r>
-          </w:p>
-        </w:tc>
-        <w:tc>
-          <w:tcPr/>
-          <w:p>
-            <w:pPr>
-              <w:pStyle w:val="Compact"/>
-            </w:pPr>
-            <w:r>
-              <w:t xml:space="preserve">~14-16 mois</w:t>
+              <w:t xml:space="preserve">~0,7 M EUR (460 M F)</w:t>
+            </w:r>
+          </w:p>
+        </w:tc>
+        <w:tc>
+          <w:tcPr/>
+          <w:p>
+            <w:pPr>
+              <w:pStyle w:val="Compact"/>
+            </w:pPr>
+            <w:r>
+              <w:t xml:space="preserve">~12-14 mois</w:t>
             </w:r>
           </w:p>
         </w:tc>
@@ -3530,7 +3530,7 @@
                 <w:b/>
                 <w:bCs/>
               </w:rPr>
-              <w:t xml:space="preserve">~1,5 M USD (900 M F)</w:t>
+              <w:t xml:space="preserve">~1,0 M EUR (655 M F)</w:t>
             </w:r>
           </w:p>
         </w:tc>
@@ -3545,7 +3545,7 @@
                 <w:b/>
                 <w:bCs/>
               </w:rPr>
-              <w:t xml:space="preserve">~20-24 mois</w:t>
+              <w:t xml:space="preserve">~18-20 mois</w:t>
             </w:r>
           </w:p>
         </w:tc>
@@ -3584,18 +3584,18 @@
               <w:pStyle w:val="Compact"/>
             </w:pPr>
             <w:r>
-              <w:t xml:space="preserve">~2,0 M USD (1,2 Md F)</w:t>
-            </w:r>
-          </w:p>
-        </w:tc>
-        <w:tc>
-          <w:tcPr/>
-          <w:p>
-            <w:pPr>
-              <w:pStyle w:val="Compact"/>
-            </w:pPr>
-            <w:r>
-              <w:t xml:space="preserve">~24 mois +</w:t>
+              <w:t xml:space="preserve">~1,3 M EUR (850 M F)</w:t>
+            </w:r>
+          </w:p>
+        </w:tc>
+        <w:tc>
+          <w:tcPr/>
+          <w:p>
+            <w:pPr>
+              <w:pStyle w:val="Compact"/>
+            </w:pPr>
+            <w:r>
+              <w:t xml:space="preserve">~22-24 mois</w:t>
             </w:r>
           </w:p>
         </w:tc>
@@ -3613,13 +3613,13 @@
       </w:tr>
     </w:tbl>
     <w:bookmarkEnd w:id="21"/>
-    <w:bookmarkStart w:id="22" w:name="X5e1ab7649e579152c4e515a4a474a5031c43d48"/>
+    <w:bookmarkStart w:id="22" w:name="X3ba7c3dd3c70aea23865fae0f74858999d5f866"/>
     <w:p>
       <w:pPr>
         <w:pStyle w:val="Heading3"/>
       </w:pPr>
       <w:r>
-        <w:t xml:space="preserve">9.3 Emploi des fonds (scénario recommandé, 900 M FCFA)</w:t>
+        <w:t xml:space="preserve">9.3 Emploi des fonds (scénario recommandé, 655 M FCFA)</w:t>
       </w:r>
     </w:p>
     <w:tbl>
@@ -3705,7 +3705,7 @@
               <w:pStyle w:val="Compact"/>
             </w:pPr>
             <w:r>
-              <w:t xml:space="preserve">270 M F</w:t>
+              <w:t xml:space="preserve">195 M F</w:t>
             </w:r>
           </w:p>
         </w:tc>
@@ -3744,7 +3744,7 @@
               <w:pStyle w:val="Compact"/>
             </w:pPr>
             <w:r>
-              <w:t xml:space="preserve">225 M F</w:t>
+              <w:t xml:space="preserve">164 M F</w:t>
             </w:r>
           </w:p>
         </w:tc>
@@ -3783,7 +3783,7 @@
               <w:pStyle w:val="Compact"/>
             </w:pPr>
             <w:r>
-              <w:t xml:space="preserve">225 M F</w:t>
+              <w:t xml:space="preserve">164 M F</w:t>
             </w:r>
           </w:p>
         </w:tc>
@@ -3822,7 +3822,7 @@
               <w:pStyle w:val="Compact"/>
             </w:pPr>
             <w:r>
-              <w:t xml:space="preserve">90 M F</w:t>
+              <w:t xml:space="preserve">66 M F</w:t>
             </w:r>
           </w:p>
         </w:tc>
@@ -3861,7 +3861,7 @@
               <w:pStyle w:val="Compact"/>
             </w:pPr>
             <w:r>
-              <w:t xml:space="preserve">90 M F</w:t>
+              <w:t xml:space="preserve">66 M F</w:t>
             </w:r>
           </w:p>
         </w:tc>
@@ -3926,7 +3926,7 @@
           <w:b/>
           <w:bCs/>
         </w:rPr>
-        <w:t xml:space="preserve">Seed 4-7 M USD</w:t>
+        <w:t xml:space="preserve">Seed 4-6 M EUR</w:t>
       </w:r>
       <w:r>
         <w:t xml:space="preserve"> </w:t>
@@ -4024,7 +4024,7 @@
         <w:t xml:space="preserve">CTO confirmé</w:t>
       </w:r>
       <w:r>
-        <w:t xml:space="preserve">. Cible ~25 personnes à M12, ~55 à M24 (tech, commercial flotte, Liaison/ops, support WhatsApp, finance/conformité).</w:t>
+        <w:t xml:space="preserve">. Cible ~25 personnes à M12, ~55 à M24 (tech, commercial flotte, Liaison/ops, support client, finance/conformité).</w:t>
       </w:r>
     </w:p>
     <w:bookmarkEnd w:id="26"/>
@@ -4328,7 +4328,7 @@
         <w:t xml:space="preserve"> </w:t>
       </w:r>
       <w:r>
-        <w:t xml:space="preserve">ne combine la marketplace consommateur, la plateforme flotte B2B et le réseau terrain Liaison ; personne n'a la conformité FNE-CI native ni la base de compatibilité Côte d'Ivoire que nous construisons transaction par transaction. Ces trois éléments (</w:t>
+        <w:t xml:space="preserve">ne combine la marketplace consommateur, la plateforme flotte B2B et la digitalisation des vendeurs de pièces détachées ; personne n'a la conformité FNE-CI native ni la base de compatibilité Côte d'Ivoire que nous construisons transaction par transaction. Ces trois éléments (</w:t>
       </w:r>
       <w:r>
         <w:rPr>
@@ -4367,7 +4367,7 @@
           <w:i/>
           <w:iCs/>
         </w:rPr>
-        <w:t xml:space="preserve">Pièces : la pièce qu'il te faut, au juste prix, livrée et garantie. · Document interne confidentiel · Plan d'affaires v1.2 · Juin 2026. Sources marché : étude Pièces « Coûts d'exploitation VTC en Côte d'Ivoire » (mai 2026), Déclic Car / 7info &amp; Digital Mag CI (Yango : 25 000 véhicules, 100 000 courses/jour, 160 entreprises, 2026), Africa Data Intelligence (VTC 2024), Ministère des Transports CI (parc ~1,2 M, 2022), Agence Ecofin &amp; Jeune Afrique (retrait Uber 2025), Disrupt Africa / TechCabal (financement 2024-2025). Chiffres financiers : projections internes à valider sur données réelles.</w:t>
+        <w:t xml:space="preserve">Pièces : la pièce qu'il te faut, au juste prix, livrée et garantie. · Document interne confidentiel · Plan d'affaires v1.3 · Juin 2026. Chiffres financiers : projections internes à valider sur données réelles.</w:t>
       </w:r>
     </w:p>
     <w:bookmarkEnd w:id="28"/>

</xml_diff>

<commit_message>
docs(plan): rétablit « bot WhatsApp » (typo) dans brique, plateforme et équipe
Co-Authored-By: Claude Opus 4.8 (1M context) <noreply@anthropic.com>
</commit_message>
<xml_diff>
--- a/docs/plan-affaires-pieces-2026-06.docx
+++ b/docs/plan-affaires-pieces-2026-06.docx
@@ -207,7 +207,7 @@
         <w:t xml:space="preserve"> </w:t>
       </w:r>
       <w:r>
-        <w:t xml:space="preserve">: marketplace, paiement à la livraison, dashboard flotte, calculateur ROI, bot conversationnel, et un catalogue de</w:t>
+        <w:t xml:space="preserve">: marketplace, paiement à la livraison, dashboard flotte, calculateur ROI, bot WhatsApp, et un catalogue de</w:t>
       </w:r>
       <w:r>
         <w:t xml:space="preserve"> </w:t>
@@ -701,7 +701,7 @@
                 <w:b/>
                 <w:bCs/>
               </w:rPr>
-              <w:t xml:space="preserve">Bot conversationnel</w:t>
+              <w:t xml:space="preserve">Bot WhatsApp</w:t>
             </w:r>
           </w:p>
         </w:tc>
@@ -4024,7 +4024,7 @@
         <w:t xml:space="preserve">CTO confirmé</w:t>
       </w:r>
       <w:r>
-        <w:t xml:space="preserve">. Cible ~25 personnes à M12, ~55 à M24 (tech, commercial flotte, Liaison/ops, support client, finance/conformité).</w:t>
+        <w:t xml:space="preserve">. Cible ~25 personnes à M12, ~55 à M24 (tech, commercial flotte, Liaison/ops, support WhatsApp, finance/conformité).</w:t>
       </w:r>
     </w:p>
     <w:bookmarkEnd w:id="26"/>

</xml_diff>